<commit_message>
docs(astrologie-karmique): deux corrections de formulation dans la leçon 01
1. « d'où elle vient réellement — la réponse surprend » devient « la
   réponse est datable ». L'accroche promettait un effet ; la leçon livre
   un fait, et c'est plus fort. 1875, la Société théosophique, puis Alan
   Leo : une date vaut mieux qu'une promesse d'étonnement.

2. « Le corpus ne prétend généralement pas à une causalité physique »
   devient « Les trois auteurs de ce parcours ne revendiquent aucune
   causalité physique ». L'adverbe atténuait une affirmation invérifiable
   sur un corpus entier ; on restreint le sujet à ce qui est vérifiable
   plutôt que de le noyer. C'est exactement la règle que le parcours
   enseigne — attribuer plutôt que généraliser.

Les 8 liens restent inchangés et valides.

Co-Authored-By: Claude Opus 5 <noreply@anthropic.com>
</commit_message>
<xml_diff>
--- a/livrables/lecons/2026-08-10_lecon-astrologie-karmique_01_cadrage-postulats-auteurs.docx
+++ b/livrables/lecons/2026-08-10_lecon-astrologie-karmique_01_cadrage-postulats-auteurs.docx
@@ -114,7 +114,7 @@
           <w:sz w:val="22"/>
           <w:szCs w:val="22"/>
         </w:rPr>
-        <w:t xml:space="preserve">d'où elle vient réellement — la réponse surprend, et elle est documentée ;</w:t>
+        <w:t xml:space="preserve">d'où elle vient réellement — la réponse est datable, et elle est documentée ;</w:t>
       </w:r>
     </w:p>
     <w:p>
@@ -1262,7 +1262,7 @@
                 <w:sz w:val="20"/>
                 <w:szCs w:val="20"/>
               </w:rPr>
-              <w:t xml:space="preserve">Le corpus ne prétend généralement pas à une causalité physique : il parle de correspondance symbolique.</w:t>
+              <w:t xml:space="preserve">Les trois auteurs de ce parcours ne revendiquent aucune causalité physique : ils parlent de correspondance symbolique.</w:t>
             </w:r>
           </w:p>
         </w:tc>

</xml_diff>